<commit_message>
Update Project Report (title and team added)
</commit_message>
<xml_diff>
--- a/doc/CS411_Project_Report.docx
+++ b/doc/CS411_Project_Report.docx
@@ -2,6 +2,94 @@
 <file path=word/document.xml><?xml version="1.0" encoding="utf-8"?>
 <w:document xmlns:mc="http://schemas.openxmlformats.org/markup-compatibility/2006" xmlns:o="urn:schemas-microsoft-com:office:office" xmlns:r="http://schemas.openxmlformats.org/officeDocument/2006/relationships" xmlns:m="http://schemas.openxmlformats.org/officeDocument/2006/math" xmlns:v="urn:schemas-microsoft-com:vml" xmlns:wp="http://schemas.openxmlformats.org/drawingml/2006/wordprocessingDrawing" xmlns:w10="urn:schemas-microsoft-com:office:word" xmlns:w="http://schemas.openxmlformats.org/wordprocessingml/2006/main" xmlns:wne="http://schemas.microsoft.com/office/word/2006/wordml" xmlns:sl="http://schemas.openxmlformats.org/schemaLibrary/2006/main" xmlns:a="http://schemas.openxmlformats.org/drawingml/2006/main" xmlns:pic="http://schemas.openxmlformats.org/drawingml/2006/picture" xmlns:c="http://schemas.openxmlformats.org/drawingml/2006/chart" xmlns:lc="http://schemas.openxmlformats.org/drawingml/2006/lockedCanvas" xmlns:dgm="http://schemas.openxmlformats.org/drawingml/2006/diagram" xmlns:wps="http://schemas.microsoft.com/office/word/2010/wordprocessingShape" xmlns:wpg="http://schemas.microsoft.com/office/word/2010/wordprocessingGroup" xmlns:w14="http://schemas.microsoft.com/office/word/2010/wordml" xmlns:w15="http://schemas.microsoft.com/office/word/2012/wordml" xmlns:w16="http://schemas.microsoft.com/office/word/2018/wordml" xmlns:w16cex="http://schemas.microsoft.com/office/word/2018/wordml/cex" xmlns:w16cid="http://schemas.microsoft.com/office/word/2016/wordml/cid" xmlns="http://schemas.microsoft.com/office/tasks/2019/documenttasks" xmlns:cr="http://schemas.microsoft.com/office/comments/2020/reactions">
   <w:body>
+    <w:p>
+      <w:pPr>
+        <w:spacing w:after="240" w:line="240" w:lineRule="auto"/>
+        <w:ind w:left="0" w:firstLine="0"/>
+        <w:jc w:val="center"/>
+        <w:rPr>
+          <w:b w:val="1"/>
+          <w:bCs w:val="1"/>
+          <w:sz w:val="24"/>
+          <w:szCs w:val="24"/>
+        </w:rPr>
+      </w:pPr>
+      <w:r>
+        <w:rPr>
+          <w:b w:val="1"/>
+          <w:bCs w:val="1"/>
+          <w:sz w:val="24"/>
+          <w:szCs w:val="24"/>
+          <w:rtl w:val="0"/>
+        </w:rPr>
+        <w:t xml:space="preserve">CS 411 Project Track 1 Report</w:t>
+      </w:r>
+    </w:p>
+    <w:p>
+      <w:pPr>
+        <w:spacing w:after="240" w:line="240" w:lineRule="auto"/>
+        <w:ind w:left="0" w:firstLine="0"/>
+        <w:jc w:val="center"/>
+        <w:rPr>
+          <w:b w:val="1"/>
+          <w:bCs w:val="1"/>
+          <w:sz w:val="24"/>
+          <w:szCs w:val="24"/>
+        </w:rPr>
+      </w:pPr>
+      <w:r>
+        <w:rPr>
+          <w:b w:val="1"/>
+          <w:bCs w:val="1"/>
+          <w:sz w:val="24"/>
+          <w:szCs w:val="24"/>
+          <w:rtl w:val="0"/>
+        </w:rPr>
+        <w:t xml:space="preserve">Team050 Hajimi</w:t>
+      </w:r>
+    </w:p>
+    <w:p>
+      <w:pPr>
+        <w:spacing w:after="240" w:line="240" w:lineRule="auto"/>
+        <w:ind w:left="0" w:firstLine="0"/>
+        <w:jc w:val="center"/>
+        <w:rPr>
+          <w:b w:val="1"/>
+          <w:bCs w:val="1"/>
+          <w:sz w:val="24"/>
+          <w:szCs w:val="24"/>
+        </w:rPr>
+      </w:pPr>
+      <w:r>
+        <w:rPr>
+          <w:b w:val="1"/>
+          <w:bCs w:val="1"/>
+          <w:sz w:val="24"/>
+          <w:szCs w:val="24"/>
+          <w:rtl w:val="0"/>
+        </w:rPr>
+        <w:t xml:space="preserve">Team Member: Zixuan Huang, Yuhui Liu, Tianxiang Wu, Wenhao Zhang</w:t>
+      </w:r>
+    </w:p>
+    <w:p>
+      <w:pPr>
+        <w:spacing w:after="240" w:lineRule="auto"/>
+        <w:ind w:left="0" w:firstLine="0"/>
+        <w:jc w:val="center"/>
+        <w:rPr>
+          <w:b w:val="1"/>
+          <w:bCs w:val="1"/>
+          <w:color w:val="212529"/>
+          <w:sz w:val="24"/>
+          <w:szCs w:val="24"/>
+        </w:rPr>
+      </w:pPr>
+      <w:r>
+        <w:rPr>
+          <w:rtl w:val="0"/>
+        </w:rPr>
+      </w:r>
+    </w:p>
     <w:p>
       <w:pPr>
         <w:spacing w:after="240" w:lineRule="auto"/>
@@ -325,7 +413,16 @@
           <w:szCs w:val="24"/>
           <w:rtl w:val="0"/>
         </w:rPr>
-        <w:t xml:space="preserve">Comparing to the original design, w</w:t>
+        <w:t xml:space="preserve">Compa</w:t>
+      </w:r>
+      <w:r>
+        <w:rPr>
+          <w:color w:val="212529"/>
+          <w:sz w:val="24"/>
+          <w:szCs w:val="24"/>
+          <w:rtl w:val="0"/>
+        </w:rPr>
+        <w:t xml:space="preserve">red to the original design, w</w:t>
       </w:r>
       <w:r>
         <w:rPr>
@@ -394,7 +491,7 @@
           <w:szCs w:val="24"/>
           <w:rtl w:val="0"/>
         </w:rPr>
-        <w:t xml:space="preserve">We created a login page for users to login show their own information. We added a stored procedure recommendation system and a trigger-based alert system for users to better choose their programs. We also added a major-job transaction for dynamically updating major job relationships and editing/creating programs for administrators to keep track of the stored information and make updates based on changes to programs and job opportunities. We removed some planned features such as the dynamic salary distribution visualization and region-based filtering. These were removed due to limited dataset availability and the amount of frontend work required to build interactive charts. Overall, the new functionalities introduced new features that may be useful to users, while the removed features allowed us to focus on delivering a stable and functional application within the time constraints.</w:t>
+        <w:t xml:space="preserve">We created a login page for users to login to show their own information. We added a stored procedure recommendation system and a trigger-based alert system for users to better choose their programs. We also added a major-job transaction for dynamically updating major job relationships and editing/creating programs for administrators to keep track of the stored information and make updates based on changes to programs and job opportunities. We removed some planned features such as the dynamic salary distribution visualization and region-based filtering. These were removed due to limited dataset availability and the amount of frontend work required to build interactive charts. Overall, the new functionalities introduced new features that may be useful to users, while the removed features allowed us to focus on delivering a stable and functional application within the time constraints.</w:t>
       </w:r>
     </w:p>
     <w:p>

</xml_diff>

<commit_message>
Update CS411_Project_Report teamwork management
</commit_message>
<xml_diff>
--- a/doc/CS411_Project_Report.docx
+++ b/doc/CS411_Project_Report.docx
@@ -910,6 +910,25 @@
           <w:rtl w:val="0"/>
         </w:rPr>
         <w:t xml:space="preserve">Yuhui wrote the SQL query for stage 3, created the stored procedure, and wrote the project report.</w:t>
+      </w:r>
+    </w:p>
+    <w:p>
+      <w:pPr>
+        <w:spacing w:after="240" w:lineRule="auto"/>
+        <w:rPr>
+          <w:color w:val="212529"/>
+          <w:sz w:val="24"/>
+          <w:szCs w:val="24"/>
+        </w:rPr>
+      </w:pPr>
+      <w:r>
+        <w:rPr>
+          <w:color w:val="212529"/>
+          <w:sz w:val="24"/>
+          <w:szCs w:val="24"/>
+          <w:rtl w:val="0"/>
+        </w:rPr>
+        <w:t xml:space="preserve">Throughout the project, we communicated frequently with each other and worked together to come up with ideas and debug the code, which helped us integrate our work smoothly. Overall, we separated the work evenly to make sure that no one has too much work to do and our teamwork was efficient and effective.</w:t>
       </w:r>
       <w:r>
         <w:rPr>

</xml_diff>